<commit_message>
SCJ revision: restructure manuscript, update figures, add response and PRISMA checklist
Co-Authored-By: Tatsuki Onishi <bougtoir@gmail.com>
</commit_message>
<xml_diff>
--- a/wada-tue-scoping-review/manuscripts/PRISMA_ScR_Checklist.docx
+++ b/wada-tue-scoping-review/manuscripts/PRISMA_ScR_Checklist.docx
@@ -1115,7 +1115,7 @@
               <w:rPr>
                 <w:sz w:val="18"/>
               </w:rPr>
-              <w:t>Results – Disease-specific sections; Table 1</w:t>
+              <w:t>Results – Disease-specific sections</w:t>
             </w:r>
           </w:p>
         </w:tc>
@@ -1383,7 +1383,7 @@
               <w:rPr>
                 <w:sz w:val="18"/>
               </w:rPr>
-              <w:t>Discussion (pp. 10–13)</w:t>
+              <w:t>Discussion</w:t>
             </w:r>
           </w:p>
         </w:tc>
@@ -1491,7 +1491,7 @@
               <w:rPr>
                 <w:sz w:val="18"/>
               </w:rPr>
-              <w:t>Conclusions</w:t>
+              <w:t>Discussion (no separate Conclusion section)</w:t>
             </w:r>
           </w:p>
         </w:tc>

</xml_diff>